<commit_message>
Trim report to meet 3000 char limit
</commit_message>
<xml_diff>
--- a/开发与应用报告.docx
+++ b/开发与应用报告.docx
@@ -54,7 +54,7 @@
           <w:b w:val="0"/>
           <w:sz w:val="32"/>
         </w:rPr>
-        <w:t>在四年级语文习作教学中，"写动物"是学生首次接触的描写类作文训练。统编版小学语文四年级上册第三单元要求学生观察一种动物，从外形、生活习性等方面进行描写。然而在实际教学中，我面临三个突出的痛点：</w:t>
+        <w:t>在四年级语文习作教学中，\u201c写动物\u201d是学生首次接触的描写类作文训练。然而实际教学中我面临三个痛点：一是指导难兼顾个体差异，一节课无法对48名学生逐一进行个性化指导。二是批改反馈周期过长，逐篇批改需要4至6小时，反馈的时效性大打折扣。三是辅助资源不足，范文数量有限，课后学生难以回顾。</w:t>
       </w:r>
     </w:p>
     <w:p>
@@ -558,7 +558,7 @@
           <w:b w:val="0"/>
           <w:sz w:val="32"/>
         </w:rPr>
-        <w:t>应用效果：** 经过三周的试用，参与班级的学生在动物类习作中的平均字数提升了约32%，写作内容从单一的"它很可爱"拓展为包含外形观察、习性描写、情感表达的多维叙述。学生对写作的兴趣明显提升，课后主动写作的学生比例从不足15%提升至约40%。教师也从中受益，作文批改的时间投入减少了约60%，可以更从容地进行教学设计和个别辅导。</w:t>
+        <w:t>应用效果：** 经过三周的试用，参与班级的学生在动物类习作中的平均字数提升了约32%，课后主动写作的学生比例从不足15%提升至约40%。教师批改时间投入减少了约60%，可以更从容地进行教学设计和个别辅导。</w:t>
       </w:r>
     </w:p>
     <w:p>
@@ -586,7 +586,7 @@
           <w:b w:val="0"/>
           <w:sz w:val="32"/>
         </w:rPr>
-        <w:t>创新点：** 一是交互模式的创新。传统教学中的写作指导受限于课堂时间和教师精力，本工具实现了"一生一导"的个性化教学，每个学生都能获得基于自身需求的实时指导。二是场景挖掘的创新。将AI能力聚焦在小学中年段"动物习作"这一具体教学节点上，精准解决了一线教学中的高频痛点，而非泛泛的"AI+写作"。三是政策合规的创新。本工具严格遵循《中小学生成式人工智能使用指南（2025年版）》和《"人工智能+教育"行动计划（2026年）》的规范要求，明确定位为教师辅助工具，AI仅提供分析建议，不替代教师评价，为AI教育工具的一线应用提供了合规范式。四是成本控制的创新。基于免费开源的Flask框架和按量付费的API服务，整个工具的开发成本几乎为零，长期使用成本仅为微量的API调用费用，具备极高的推广复现价值。</w:t>
+        <w:t>创新点：** 一是交互模式的创新。本工具实现了"一生一导"的个性化教学，每个学生都能获得基于自身需求的实时指导。二是场景挖掘的创新。将AI能力聚焦在小学中年段"动物习作"这一具体教学节点上，精准解决了一线教学中的高频痛点。三是政策合规的创新。本工具严格遵循《中小学生成式人工智能使用指南（2025年版）》和《"人工智能+教育"行动计划（2026年）》的规范要求，明确定位为教师辅助工具，为AI教育工具的一线应用提供了合规范式。四是成本控制的创新。基于免费开源的Flask框架和按量付费的API服务，开发成本几乎为零，具备极高的推广复现价值。</w:t>
       </w:r>
     </w:p>
     <w:p>

</xml_diff>